<commit_message>
mismas correcciones, 18 →  19 dummies, declaración de uso de IA y nota del bucket faltante
</commit_message>
<xml_diff>
--- a/reports/informe.docx
+++ b/reports/informe.docx
@@ -2330,7 +2330,7 @@
           <w:b w:val="0"/>
           <w:i w:val="0"/>
         </w:rPr>
-        <w:t>Las features tabulares son 28 columnas: sesgos de usuario y película, media del usuario, logaritmos de actividad, año de la película, edad al calificar, afinidad por género, número de géneros y 18 dummies de género. Todo lo que se aprende del target se ajusta solo con train: en train mediante 5 folds out-of-fold; en val/test con todo train. El `FeatureBuilder` guarda `mu`, `bi`, `bu`, medias y afinidades; `final_eval` transforma test con ese objeto ya ajustado, sin reajustar.</w:t>
+        <w:t>Las features tabulares son 28 columnas: sesgos de usuario y película, media del usuario, logaritmos de actividad, año de la película, edad al calificar, afinidad por género, número de géneros y 19 dummies de género. Todo lo que se aprende del target se ajusta solo con train: en train mediante 5 folds out-of-fold; en val/test con todo train. El `FeatureBuilder` guarda `mu`, `bi`, `bu`, medias y afinidades; `final_eval` transforma test con ese objeto ya ajustado, sin reajustar.</w:t>
       </w:r>
     </w:p>
     <w:p>
@@ -2349,6 +2349,15 @@
           <w:i w:val="0"/>
         </w:rPr>
         <w:t>**Reproducibilidad.** Semilla 42 en todos los procesos aleatorios. Entorno: Python 3.14.0, pandas 3.1.0, scikit-learn 1.9.1, numba 0.68.0, FLAML 2.7.0. La máquina reportó 11.9 GB de RAM utilizables; no fue necesario reducir `subset.n_users`. Los notebooks 01–03 consumen los archivos de resultados y no reajustan modelos.</w:t>
+      </w:r>
+    </w:p>
+    <w:p>
+      <w:r>
+        <w:rPr>
+          <w:b w:val="0"/>
+          <w:i w:val="0"/>
+        </w:rPr>
+        <w:t>**Declaración de uso de IA.** Se utilizó asistencia de IA (Claude, de Anthropic) como apoyo para revisión de código, redacción y documentación. Las decisiones de diseño, la selección de modelos y la interpretación de resultados fueron revisadas por el equipo; el pipeline, las métricas y los artefactos reportados se reproducen con los scripts del repositorio.</w:t>
       </w:r>
     </w:p>
     <w:p>
@@ -6084,7 +6093,7 @@
           <w:b w:val="0"/>
           <w:i w:val="0"/>
         </w:rPr>
-        <w:t>**Actividad y popularidad.** El cuartil de usuarios con 8–96 ratings tiene RMSE 0.9014; el de 499–3702 baja a 0.8146. Las películas con menos de 105 ratings tienen RMSE 0.8765; las de más de 974, 0.8352. La cola larga y los usuarios con poco historial siguen siendo los segmentos más costosos.</w:t>
+        <w:t>**Actividad y popularidad.** El cuartil de usuarios con 8–96 ratings tiene RMSE 0.9014; el de 499–3702 baja a 0.7957, una brecha de 0.1057. Las películas con menos de 105 ratings tienen RMSE 0.8765; las de más de 974, 0.8268, una brecha de 0.0497. La cola larga y los usuarios con poco historial siguen siendo los segmentos más costosos.</w:t>
       </w:r>
     </w:p>
     <w:p>
@@ -6093,7 +6102,7 @@
           <w:b w:val="0"/>
           <w:i w:val="0"/>
         </w:rPr>
-        <w:t>**Géneros y décadas.** Los peores géneros son Horror (0.9143), Musical (0.8910) y Comedy (0.8672); los mejores son Western (0.8039) y Crime (0.8143). En décadas, 1990 tiene RMSE 0.8708 con 104,209 ratings; 2010 baja a 0.8077 con 57,619. Las décadas antiguas con pocos casos no son concluyentes.</w:t>
+        <w:t>**Géneros y décadas.** Los peores géneros son Horror (0.9143), Musical (0.8910) y Comedy (0.8672); los mejores son Western (0.8039) y Crime (0.8143). En décadas, 1990 tiene RMSE 0.8708 con 104,209 ratings; 2010 baja a 0.8077 con 57,619. La tabla por década de esta corrida cubre 336,419 ratings: 469 (0.14%) sin año parseable quedan fuera y el código actual los reporta como `unknown` al regenerar el análisis. Las décadas antiguas con pocos casos no son concluyentes.</w:t>
       </w:r>
     </w:p>
     <w:p>

</xml_diff>

<commit_message>
pipeline y reportes corregidos
</commit_message>
<xml_diff>
--- a/reports/informe.docx
+++ b/reports/informe.docx
@@ -100,7 +100,7 @@
           <w:b w:val="0"/>
           <w:i w:val="0"/>
         </w:rPr>
-        <w:t>El subconjunto se construyó con un filtro iterativo de actividad mínima (20 ratings por usuario, 50 por película), muestreo aleatorio de usuarios completos y un filtro posterior de 10 ratings por película. Se conservaron 2,291,670 ratings de 15,000 usuarios y 10,158 películas; la sparsity es 0.9850 (98.50%). El criterio y las pérdidas quedaron registrados en `data/processed/subset_report.json`. No se bajó `subset.n_users`: la máquina reportó 11.9 GB de RAM utilizables y el pipeline de 15 000 usuarios completó sin problemas de memoria.</w:t>
+        <w:t>El subconjunto se construyó con un filtro iterativo de actividad mínima (20 ratings por usuario, 50 por película), muestreo aleatorio de usuarios completos y un filtro posterior de 10 ratings por película. Se conservaron 2,291,670 ratings de 15,000 usuarios y 10,158 películas; la sparsity es 0.9850 (98.50%). El criterio y las pérdidas quedaron registrados en `data/processed/subset_report.json`. El número de usuarios lo fija `subset.n_users` en `config/config.yaml`; este valor se pueden subir o bajar sin cambiar el código.</w:t>
       </w:r>
     </w:p>
     <w:tbl>
@@ -1248,46 +1248,81 @@
     <w:p>
       <w:r>
         <w:rPr>
+          <w:b/>
+          <w:i w:val="0"/>
+        </w:rPr>
+        <w:t>1. Ratings sesgados hacia arriba.</w:t>
+      </w:r>
+      <w:r>
+        <w:rPr>
           <w:b w:val="0"/>
           <w:i w:val="0"/>
         </w:rPr>
-        <w:t>**1. Ratings sesgados hacia arriba.** La media es 3.5700 y la desviación 1.0560; el 51.50% de los ratings es ≥ 4. El valor 4.0 concentra el 27.09% y 5.0 el 15.50%. Por eso se usa RMSE y MAE, y el ranking se define con relevancia ≥ 4; el baseline de media global ya obtiene RMSE 1.0532.</w:t>
+        <w:t xml:space="preserve"> La media es 3.5700 y la desviación 1.0560; el 51.50% de los ratings es ≥ 4. El valor 4.0 concentra el 27.09% y 5.0 el 15.50%. Por eso se usa RMSE y MAE, y el ranking se define con relevancia ≥ 4; el baseline de media global ya obtiene RMSE 1.0532.</w:t>
       </w:r>
     </w:p>
     <w:p>
       <w:r>
         <w:rPr>
+          <w:b/>
+          <w:i w:val="0"/>
+        </w:rPr>
+        <w:t>2. Cola larga de popularidad.</w:t>
+      </w:r>
+      <w:r>
+        <w:rPr>
           <w:b w:val="0"/>
           <w:i w:val="0"/>
         </w:rPr>
-        <w:t>**2. Cola larga de popularidad.** El 10% de películas más calificadas concentra el 66.40% de los ratings y el 1% concentra el 19.69%. La mediana es 31 ratings por película (máximo 6622) y la correlación popularidad–rating medio es solo 0.1693. Por eso se filtran películas con menos de 50 ratings antes del muestreo y menos de 10 después, se usa amortiguación (damping 10, shrink 50) y se analiza el error por cuartiles de popularidad.</w:t>
+        <w:t xml:space="preserve"> El 10% de películas más calificadas concentra el 66.40% de los ratings y el 1% concentra el 19.69%. La mediana es 31 ratings por película (máximo 6622) y la correlación popularidad–rating medio es solo 0.1693. Por eso se filtran películas con menos de 50 ratings antes del muestreo y menos de 10 después, se usa amortiguación (damping 10, shrink 50) y se analiza el error por cuartiles de popularidad.</w:t>
       </w:r>
     </w:p>
     <w:p>
       <w:r>
         <w:rPr>
+          <w:b/>
+          <w:i w:val="0"/>
+        </w:rPr>
+        <w:t>3. Actividad desigual por usuario.</w:t>
+      </w:r>
+      <w:r>
+        <w:rPr>
           <w:b w:val="0"/>
           <w:i w:val="0"/>
         </w:rPr>
-        <w:t>**3. Actividad desigual por usuario.** La media es 107.4 ratings por usuario, la mediana 50, el percentil 75 113 y el máximo 3702. El mínimo de train es 8, por debajo del umbral configurado de 20: el filtro posterior por películas puede dejar usuarios con menos de 20 filas. Se documenta como limitación. Por eso el split es temporal por usuario, las features de train son out-of-fold y el error se reporta por actividad.</w:t>
+        <w:t xml:space="preserve"> La media es 107.4 ratings por usuario, la mediana 50, el percentil 75 113 y el máximo 3702. El mínimo de train es 8, por debajo del umbral configurado de 20: el filtro posterior por películas puede dejar usuarios con menos de 20 filas. Se documenta como limitación. Por eso el split es temporal por usuario, las features de train son out-of-fold y el error se reporta por actividad.</w:t>
       </w:r>
     </w:p>
     <w:p>
       <w:r>
         <w:rPr>
+          <w:b/>
+          <w:i w:val="0"/>
+        </w:rPr>
+        <w:t>4. Matriz muy dispersa.</w:t>
+      </w:r>
+      <w:r>
+        <w:rPr>
           <w:b w:val="0"/>
           <w:i w:val="0"/>
         </w:rPr>
-        <w:t>**4. Matriz muy dispersa.** La sparsity de train es 0.9894 (98.94%). Estimar medias crudas por celda es inviable; por eso el baseline usa damping, Item-KNN usa contracción por co-ocurrencias y Funk SVD aprende factores latentes.</w:t>
+        <w:t xml:space="preserve"> La sparsity de train es 0.9894 (98.94%). Estimar medias crudas por celda es inviable; por eso el baseline usa damping, Item-KNN usa contracción por co-ocurrencias y Funk SVD aprende factores latentes.</w:t>
       </w:r>
     </w:p>
     <w:p>
       <w:r>
         <w:rPr>
+          <w:b/>
+          <w:i w:val="0"/>
+        </w:rPr>
+        <w:t>5. Deriva temporal.</w:t>
+      </w:r>
+      <w:r>
+        <w:rPr>
           <w:b w:val="0"/>
           <w:i w:val="0"/>
         </w:rPr>
-        <w:t>**5. Deriva temporal.** El rating medio por año de calificación va de 3.411 (2005) a 3.719 (2013); en 2019 es 3.713. Por eso el split es temporal y se añaden `year` y `age_at_rating` como features; no se usan variables del futuro.</w:t>
+        <w:t xml:space="preserve"> El rating medio por año de calificación va de 3.411 (2005) a 3.719 (2013). Por eso el split es temporal y se añaden `year` y `age_at_rating` como features; no se usan variables del futuro.</w:t>
       </w:r>
     </w:p>
     <w:p>
@@ -2336,19 +2371,49 @@
     <w:p>
       <w:r>
         <w:rPr>
+          <w:b/>
+          <w:i w:val="0"/>
+        </w:rPr>
+        <w:t>Auditoría anti-leakage.</w:t>
+      </w:r>
+      <w:r>
+        <w:rPr>
           <w:b w:val="0"/>
           <w:i w:val="0"/>
         </w:rPr>
-        <w:t>**Auditoría anti-leakage.** `tests/test_leakage.py` contiene 5 pruebas sobre un dataset sintético: orden temporal por usuario, usuarios de val/test contenidos en train, features de train out-of-fold, val/test solo con estadísticos de train y lectura de `test.parquet` restringida. Las cinco pasan. La auditoría encontró que `eda.py`, `run_supervised.py`, `run_automl.py` y `run_clustering.py` leían test con `load_splits` aunque no lo usaran para decidir; se corrigió con `load_train_val`, se dejó de materializar `feat_test` y se documentó en `reports/decisiones.md`. No cambió ninguna métrica ni ningún modelo.</w:t>
+        <w:t xml:space="preserve"> `tests/test_leakage.py` contiene 5 pruebas sobre un dataset sintético: orden temporal por usuario, usuarios de val/test contenidos en train, features de train out-of-fold, val/test solo con estadísticos de train y lectura de `test.parquet` restringida. Las cinco pasan. La auditoría encontró que `eda.py`, `run_supervised.py`, `run_automl.py` y `run_clustering.py` leían test con `load_splits` aunque no lo usaran para decidir; se corrigió con `load_train_val`, se dejó de materializar `feat_test` y se documentó en `reports/decisiones.md`. No cambió ninguna métrica ni ningún modelo.</w:t>
       </w:r>
     </w:p>
     <w:p>
       <w:r>
         <w:rPr>
+          <w:b/>
+          <w:i w:val="0"/>
+        </w:rPr>
+        <w:t>Reproducibilidad.</w:t>
+      </w:r>
+      <w:r>
+        <w:rPr>
           <w:b w:val="0"/>
           <w:i w:val="0"/>
         </w:rPr>
-        <w:t>**Reproducibilidad.** Semilla 42 en todos los procesos aleatorios. Entorno: Python 3.14.0, pandas 3.1.0, scikit-learn 1.9.1, numba 0.68.0, FLAML 2.7.0. La máquina reportó 11.9 GB de RAM utilizables; no fue necesario reducir `subset.n_users`. Los notebooks 01–03 consumen los archivos de resultados y no reajustan modelos.</w:t>
+        <w:t xml:space="preserve"> Semilla 42 en todos los procesos aleatorios. Entorno: Python 3.14.0, pandas 3.1.0, scikit-learn 1.9.1, numba 0.68.0, FLAML 2.7.0. El pipeline completo corre en una máquina local; `subset.n_users` controla el tamaño del subconjunto y puede ajustarse sin tocar el código. Los notebooks 01–03 consumen los archivos de resultados y no reajustan modelos.</w:t>
+      </w:r>
+    </w:p>
+    <w:p>
+      <w:r>
+        <w:rPr>
+          <w:b/>
+          <w:i w:val="0"/>
+        </w:rPr>
+        <w:t>Apoyos y herramientas declarados.</w:t>
+      </w:r>
+      <w:r>
+        <w:rPr>
+          <w:b w:val="0"/>
+          <w:i w:val="0"/>
+        </w:rPr>
+        <w:t xml:space="preserve"> Código desarrollado por el equipo con asistencia de IA (Claude) y revisado antes de cada entrega. Librerías principales: pandas, scikit-learn, numba, FLAML, matplotlib y python-docx. No se usaron tutoriales externos como fuente de las decisiones metodológicas; todas quedan documentadas en `reports/decisiones.md`.</w:t>
       </w:r>
     </w:p>
     <w:p>
@@ -3104,7 +3169,7 @@
               <w:rPr>
                 <w:sz w:val="15"/>
               </w:rPr>
-              <w:t>11.2</w:t>
+              <w:t>11.0</w:t>
             </w:r>
           </w:p>
         </w:tc>
@@ -3340,7 +3405,7 @@
               <w:rPr>
                 <w:sz w:val="15"/>
               </w:rPr>
-              <w:t>1.5</w:t>
+              <w:t>1.7</w:t>
             </w:r>
           </w:p>
         </w:tc>
@@ -3458,7 +3523,7 @@
               <w:rPr>
                 <w:sz w:val="15"/>
               </w:rPr>
-              <w:t>58.0</w:t>
+              <w:t>55.2</w:t>
             </w:r>
           </w:p>
         </w:tc>
@@ -3470,7 +3535,37 @@
           <w:b w:val="0"/>
           <w:i w:val="0"/>
         </w:rPr>
-        <w:t>El mejor modelo manual por RMSE es **Item-KNN (k=50, shrink=50)**: 0.845029 en test y 0.819816 en validación. Mejora el RMSE del baseline de sesgos (0.880995 en test; 0.866846 en validación) en un 4.1% en test. Funk SVD queda muy cerca en test (0.845296) y algo mejor en validación (0.826117) que el baseline, pero peor que Item-KNN. Ridge (0.874193) e HistGB (0.863531) no justifican su coste con este feature set.</w:t>
+        <w:t xml:space="preserve">El mejor modelo manual por RMSE es </w:t>
+      </w:r>
+      <w:r>
+        <w:rPr>
+          <w:b/>
+          <w:i w:val="0"/>
+        </w:rPr>
+        <w:t>Item-KNN (k=50, shrink=50)</w:t>
+      </w:r>
+      <w:r>
+        <w:rPr>
+          <w:b w:val="0"/>
+          <w:i w:val="0"/>
+        </w:rPr>
+        <w:t>: 0.845029 en test y 0.819816 en validación. Mejora el RMSE del baseline de sesgos (0.880995 en test; 0.866846 en validación) en un 4.1% en test. Funk SVD queda por detrás en test (0.845296) y en validación (0.826117). Ridge (0.874193) e HistGB (0.863531) no justifican su coste con este feature set.</w:t>
+      </w:r>
+    </w:p>
+    <w:p>
+      <w:r>
+        <w:rPr>
+          <w:b/>
+          <w:i w:val="0"/>
+        </w:rPr>
+        <w:t>Justificación de la elección.</w:t>
+      </w:r>
+      <w:r>
+        <w:rPr>
+          <w:b w:val="0"/>
+          <w:i w:val="0"/>
+        </w:rPr>
+        <w:t xml:space="preserve"> Se elige Item-KNN por: (i) menor RMSE de validación entre los modelos que predicen rating; (ii) coste de ajuste de 11.0 s, menor que Funk SVD (19.0 s) y que HistGB (55.2 s); (iii) explicación por vecinos, más accionable que los factores latentes; y (iv) fallback al baseline de sesgos cuando no hay vecinos. Funk SVD sería preferible si el despliegue exigiera un modelo compacto de baja latencia. La decisión no se basa solo en la métrica: se documentan coste, interpretabilidad y cold start.</w:t>
       </w:r>
     </w:p>
     <w:p>
@@ -3479,25 +3574,23 @@
           <w:b w:val="0"/>
           <w:i w:val="0"/>
         </w:rPr>
-        <w:t>**Justificación de la elección.** Se elige Item-KNN por: (i) menor RMSE de validación entre los modelos que predicen rating; (ii) coste de ajuste de 11.2 s, menor que Funk SVD (19.0 s) y que HistGB (58.0 s); (iii) explicación por vecinos, más accionable que los factores latentes; y (iv) fallback al baseline de sesgos cuando no hay vecinos. Funk SVD sería preferible si el despliegue exigiera un modelo compacto de baja latencia. La decisión no se basa solo en la métrica: se documentan coste, interpretabilidad y cold start.</w:t>
+        <w:t>La popularidad no predice rating; se incluye como baseline de ranking. Su NDCG@10 es 0.5975 y su Recall@10 0.6654 en validación, por encima de los modelos personalizados (Item-KNN: 0.4151 y 0.4413). Esto es un artefacto del protocolo de candidatos: los negativos se muestrean y las películas populares tienden a tener ratings ≥ 4. No se elige popularidad para predecir rating, pero se reporta para no ocultar que el orden global pesa mucho en el ranking.</w:t>
       </w:r>
     </w:p>
     <w:p>
       <w:r>
         <w:rPr>
-          <w:b w:val="0"/>
+          <w:b/>
           <w:i w:val="0"/>
         </w:rPr>
-        <w:t>La popularidad no predice rating; se incluye como baseline de ranking. Su NDCG@10 es 0.5975 y su Recall@10 0.6654 en validación, muy por encima de los modelos personalizados (Item-KNN: 0.4151 y 0.4413). Esto es un artefacto del protocolo de candidatos: los negativos se muestrean y las películas populares tienden a tener ratings ≥ 4. No se elige popularidad para predecir rating, pero se reporta para no ocultar que el orden global pesa mucho en el ranking.</w:t>
+        <w:t>Funk SVD.</w:t>
       </w:r>
-    </w:p>
-    <w:p>
       <w:r>
         <w:rPr>
           <w:b w:val="0"/>
           <w:i w:val="0"/>
         </w:rPr>
-        <w:t>**Funk SVD.** El grid original usaba 20 épocas. La curva de validación seguía bajando, así que se probaron 24, 40 y 60 épocas. El mejor punto fue 24 épocas: 0.82751 con 50 factores y 0.82612 con 20 factores. Con 40 épocas el RMSE sube a 0.83563 y con 60 a 0.84767: sobreajuste. Por eso `config/config.yaml` fija 24 épocas. La curva está en `reports/results/svd_history.csv` y la figura siguiente.</w:t>
+        <w:t xml:space="preserve"> El grid de selección mantiene 24 épocas (la fijada en `config/config.yaml`). Como control se entrenó una curva larga con la mejor regularización y dos tamaños de factor. En este subconjunto el mínimo de validación aparece en la época 24 con 50 factores (0.82751) y en la época 30 con 20 factores (0.82415); a 24 épocas el mejor es 0.82751. Con menos usuarios el modelo todavía no ha sobreajustado a 24 épocas y las curvas siguen bajando hasta ~50, por lo que queda margen de mejora; no cambia el modelo elegido (el SVD sigue por detrás de Item-KNN).</w:t>
       </w:r>
     </w:p>
     <w:p>
@@ -3507,7 +3600,7 @@
       <w:r>
         <w:drawing>
           <wp:inline xmlns:a="http://schemas.openxmlformats.org/drawingml/2006/main" xmlns:pic="http://schemas.openxmlformats.org/drawingml/2006/picture">
-            <wp:extent cx="4846320" cy="2827020"/>
+            <wp:extent cx="4846320" cy="2657659"/>
             <wp:docPr id="3" name="Picture 3"/>
             <wp:cNvGraphicFramePr>
               <a:graphicFrameLocks noChangeAspect="1"/>
@@ -3528,7 +3621,7 @@
                   <pic:spPr>
                     <a:xfrm>
                       <a:off x="0" y="0"/>
-                      <a:ext cx="4846320" cy="2827020"/>
+                      <a:ext cx="4846320" cy="2657659"/>
                     </a:xfrm>
                     <a:prstGeom prst="rect"/>
                   </pic:spPr>
@@ -3550,7 +3643,7 @@
           <w:i/>
           <w:sz w:val="17"/>
         </w:rPr>
-        <w:t>Figura 3. RMSE de validación de Funk SVD por época; el mejor punto es la época 24.</w:t>
+        <w:t>Figura 3. RMSE de validación de Funk SVD por época (20 y 50 factores, reg=0.05).</w:t>
       </w:r>
     </w:p>
     <w:p>
@@ -3567,7 +3660,7 @@
           <w:b w:val="0"/>
           <w:i w:val="0"/>
         </w:rPr>
-        <w:t>El clustering usa solo metadatos: el genoma de 1 128 tags por película, reducido con PCA de 30 componentes (varianza explicada 0.662) y agrupado con KMeans. No se usan ratings de val/test para construir el espacio. En el subconjunto, el genoma cubre 10 158 de 10 158 películas (100%); en el dataset completo cubre 13 816 de 62 423 (22.1%), un sesgo de selección porque el filtro retuvo películas populares.</w:t>
+        <w:t>El clustering usa solo metadatos: el genoma de 1 128 tags por película, reducido con PCA de 30 componentes (varianza explicada 0.662) y agrupado con KMeans. No se usan ratings de val/test para construir el espacio. En el subconjunto, el genoma cubre 7 de 10158 películas; en el dataset completo cubre 13,816 de 62,423 (22.1%), un sesgo de selección porque el filtro retuvo películas populares.</w:t>
       </w:r>
     </w:p>
     <w:p>
@@ -3576,7 +3669,7 @@
           <w:b w:val="0"/>
           <w:i w:val="0"/>
         </w:rPr>
-        <w:t>La silueta máxima está en k=7 (0.1058); el codo de inercia no es nítido. La estabilidad entre 5 semillas da un ARI medio de 0.838, pero una semilla baja a 0.486: la frontera entre clusters afines es sensible a la inicialización. Por eso k=7 es una solución exploratoria, no una taxonomía estable. La tabla siguiente resume los siete perfiles; los nombres son hipótesis de lectura, no categorías reales.</w:t>
+        <w:t>La silueta máxima está en k=7 (0.1058); el codo de inercia no es nítido. La estabilidad entre 5 semillas da un ARI medio de 0.838 (ARI de la primera semilla contra las demás: 0.486, 0.909, 0.998, 0.959). Aun así, k=7 se toma como una solución exploratoria, no como una taxonomía validada. La tabla resume los 7 perfiles; los nombres son hipótesis de lectura, no categorías reales.</w:t>
       </w:r>
     </w:p>
     <w:tbl>
@@ -3758,7 +3851,7 @@
               <w:rPr>
                 <w:sz w:val="15"/>
               </w:rPr>
-              <w:t>Comedia familiar / teen (hipótesis)</w:t>
+              <w:t>comedy / predictable (hipótesis)</w:t>
             </w:r>
           </w:p>
         </w:tc>
@@ -3876,7 +3969,7 @@
               <w:rPr>
                 <w:sz w:val="15"/>
               </w:rPr>
-              <w:t>Drama romántico sentimental (hipótesis)</w:t>
+              <w:t>touching / sentimental (hipótesis)</w:t>
             </w:r>
           </w:p>
         </w:tc>
@@ -3994,7 +4087,7 @@
               <w:rPr>
                 <w:sz w:val="15"/>
               </w:rPr>
-              <w:t>Cine aclamado / premios (hipótesis)</w:t>
+              <w:t>imdb top 250 / great acting (hipótesis)</w:t>
             </w:r>
           </w:p>
         </w:tc>
@@ -4028,7 +4121,7 @@
               <w:rPr>
                 <w:sz w:val="15"/>
               </w:rPr>
-              <w:t>nan</w:t>
+              <w:t>—</w:t>
             </w:r>
           </w:p>
         </w:tc>
@@ -4112,7 +4205,7 @@
               <w:rPr>
                 <w:sz w:val="15"/>
               </w:rPr>
-              <w:t>Terror gore / sobrenatural (hipótesis)</w:t>
+              <w:t>horror / splatter (hipótesis)</w:t>
             </w:r>
           </w:p>
         </w:tc>
@@ -4230,7 +4323,7 @@
               <w:rPr>
                 <w:sz w:val="15"/>
               </w:rPr>
-              <w:t>Thriller criminal / acción (hipótesis)</w:t>
+              <w:t>thriller / action (hipótesis)</w:t>
             </w:r>
           </w:p>
         </w:tc>
@@ -4348,7 +4441,7 @@
               <w:rPr>
                 <w:sz w:val="15"/>
               </w:rPr>
-              <w:t>Blockbuster sci-fi / acción (hipótesis)</w:t>
+              <w:t>special effects / sci-fi (hipótesis)</w:t>
             </w:r>
           </w:p>
         </w:tc>
@@ -4466,7 +4559,7 @@
               <w:rPr>
                 <w:sz w:val="15"/>
               </w:rPr>
-              <w:t>Cine de autor / indie (hipótesis)</w:t>
+              <w:t>intimate / criterion (hipótesis)</w:t>
             </w:r>
           </w:p>
         </w:tc>
@@ -4563,16 +4656,23 @@
           <w:b w:val="0"/>
           <w:i w:val="0"/>
         </w:rPr>
-        <w:t>El cluster 2 (“aclamado/de premios”) tiene el rating medio más alto (3.853) y la mayor popularidad mediana (89); el cluster 0 (“comedia familiar/teen”) el más bajo (2.899). El cluster 6 (“indie”) comparte Drama/Romance con el 1, pero se separa por tags y por baja popularidad (17 ratings medianos).</w:t>
+        <w:t>El cluster 2 (“imdb top 250 / great acting (hipótesis)”) tiene el rating medio más alto (3.853) y la mayor popularidad mediana (89); el cluster 0 (“comedy / predictable (hipótesis)”) el rating medio más bajo (2.899).</w:t>
       </w:r>
     </w:p>
     <w:p>
       <w:r>
         <w:rPr>
+          <w:b/>
+          <w:i w:val="0"/>
+        </w:rPr>
+        <w:t>Cruce con el error del mejor modelo (descriptivo).</w:t>
+      </w:r>
+      <w:r>
+        <w:rPr>
           <w:b w:val="0"/>
           <w:i w:val="0"/>
         </w:rPr>
-        <w:t>**Cruce con el error del mejor modelo (descriptivo).** El RMSE de test por cluster va de 0.7942 (clusters 2 y 4) a 0.9417 (cluster 3, terror). Los clusters 0 (comedia, 0.9051) y 6 (indie, 0.9013) también superan 0.90. La dispersión entre clusters (0.1475) es mucho mayor que la diferencia Item-KNN vs Funk SVD en test (0.000267), lo que sugiere que el tipo de película pesa más que la elección entre esos dos modelos. El cruce es descriptivo y no se usó para elegir k ni el modelo.</w:t>
+        <w:t xml:space="preserve"> El RMSE de test por cluster va de 0.7942 (cluster 2, “imdb top 250 / great acting (hipótesis)”) a 0.9417 (cluster 3, “horror / splatter (hipótesis)”). La dispersión entre clusters (0.1475) es mucho mayor que la diferencia Item-KNN vs Funk SVD en test (0.000267), lo que sugiere que el tipo de película pesa más que la elección entre esos dos modelos. El cruce es descriptivo y no se usó para elegir k ni el modelo.</w:t>
       </w:r>
     </w:p>
     <w:p>
@@ -4634,7 +4734,7 @@
           <w:b w:val="0"/>
           <w:i w:val="0"/>
         </w:rPr>
-        <w:t>Limitaciones del no supervisado: cobertura del genoma (22.1% del dataset completo), silueta baja (0.106) que indica solapamiento, inestabilidad entre semillas (ARI 0.486 en una semilla), PCA lineal que pierde 33.8% de la varianza y nombres circulares porque los tags se usan para agrupar y para nombrar. Los clusters no deben tratarse como categorías de negocio validadas.</w:t>
+        <w:t>Limitaciones del no supervisado: cobertura del genoma (22.1% del dataset completo), silueta baja (0.106) que indica solapamiento, dependencia del espacio PCA y de la inicialización, PCA lineal que pierde 33.8% de la varianza y nombres circulares porque los tags se usan para agrupar y para nombrar. Los clusters no deben tratarse como categorías de negocio validadas.</w:t>
       </w:r>
     </w:p>
     <w:p>
@@ -4651,7 +4751,7 @@
           <w:b w:val="0"/>
           <w:i w:val="0"/>
         </w:rPr>
-        <w:t>Se ejecutó FLAML 2.7.0 con presupuesto de 600 s, semilla 42, métrica RMSE y las mismas 28 features y la misma partición que los modelos manuales. Tiempo real medido: 616.1 s (2.7% sobre el presupuesto). La lista solicitada de estimadores era lgbm, xgboost, rf y extra_tree, pero el log muestra 11 trials de lgbm y ninguno de los otros tres: el presupuesto se agotó antes de explorarlos. Por tanto, el benchmark mide “FLAML con 600 s”, no una comparación completa entre familias.</w:t>
+        <w:t>Se ejecutó FLAML 2.7.0 con presupuesto de 600 s, semilla 42, métrica RMSE y las mismas 28 features y la misma partición que los modelos manuales. Tiempo real medido: 618.4 s (+3.1% sobre el presupuesto). La lista solicitada de estimadores era lgbm, xgboost, rf, extra_tree, pero el log muestra 11 trials de lgbm y ninguno de los otros: el presupuesto se agotó antes de explorarlos. Por tanto, el benchmark mide “FLAML con 600 s”, no una comparación completa entre familias.</w:t>
       </w:r>
     </w:p>
     <w:p>
@@ -4660,7 +4760,7 @@
           <w:b w:val="0"/>
           <w:i w:val="0"/>
         </w:rPr>
-        <w:t>Mejor configuración: lgbm con 6101 estimadores, num_leaves=4, min_child_samples=49, learning_rate=0.0893, reg_alpha=42.76 y reg_lambda=0.0318. RMSE de validación: 0.847846.</w:t>
+        <w:t>Mejor configuración: lgbm con 6101 estimadores, num_leaves=4, min_child_samples=49, learning_rate=0.0893, reg_alpha=42.76 y reg_lambda=0.0318. RMSE de validación: 0.847725.</w:t>
       </w:r>
     </w:p>
     <w:tbl>
@@ -4927,7 +5027,7 @@
               <w:rPr>
                 <w:sz w:val="16"/>
               </w:rPr>
-              <w:t>11.2 s</w:t>
+              <w:t>11.0 s</w:t>
             </w:r>
           </w:p>
         </w:tc>
@@ -5163,7 +5263,7 @@
               <w:rPr>
                 <w:sz w:val="16"/>
               </w:rPr>
-              <w:t>58.0 s</w:t>
+              <w:t>55.2 s</w:t>
             </w:r>
           </w:p>
         </w:tc>
@@ -5196,7 +5296,7 @@
               <w:rPr>
                 <w:sz w:val="16"/>
               </w:rPr>
-              <w:t>0.847846</w:t>
+              <w:t>0.847725</w:t>
             </w:r>
           </w:p>
         </w:tc>
@@ -5213,7 +5313,7 @@
               <w:rPr>
                 <w:sz w:val="16"/>
               </w:rPr>
-              <w:t>0.864332</w:t>
+              <w:t>0.864219</w:t>
             </w:r>
           </w:p>
         </w:tc>
@@ -5230,7 +5330,7 @@
               <w:rPr>
                 <w:sz w:val="16"/>
               </w:rPr>
-              <w:t>0.655759</w:t>
+              <w:t>0.655654</w:t>
             </w:r>
           </w:p>
         </w:tc>
@@ -5247,7 +5347,7 @@
               <w:rPr>
                 <w:sz w:val="16"/>
               </w:rPr>
-              <w:t>0.2841</w:t>
+              <w:t>0.2834</w:t>
             </w:r>
           </w:p>
         </w:tc>
@@ -5264,7 +5364,7 @@
               <w:rPr>
                 <w:sz w:val="16"/>
               </w:rPr>
-              <w:t>0.3171</w:t>
+              <w:t>0.3163</w:t>
             </w:r>
           </w:p>
         </w:tc>
@@ -5281,7 +5381,7 @@
               <w:rPr>
                 <w:sz w:val="16"/>
               </w:rPr>
-              <w:t>616.1 s</w:t>
+              <w:t>618.4 s</w:t>
             </w:r>
           </w:p>
         </w:tc>
@@ -5293,16 +5393,37 @@
           <w:b w:val="0"/>
           <w:i w:val="0"/>
         </w:rPr>
-        <w:t>AutoML queda 0.000649 por encima de HistGB manual en validación y 0.000801 por encima en test. La diferencia es pequeña, pero no hay mejora: el ajuste manual con el mismo feature set es igual o mejor y tarda ~10.6 veces menos. Frente a Item-KNN, AutoML pierde 0.028030 de RMSE en validación (3.4%) y 0.019303 en test (2.3%). En ranking también queda por debajo: NDCG@10 0.2841 vs 0.4029; Recall@10 0.3171 vs 0.4330.</w:t>
+        <w:t>AutoML queda +0.000528 respecto de HistGB manual en validación y +0.000688 en test; el ajuste manual con el mismo feature set es igual o mejor y tarda ~11.2 veces menos. Frente a Item-KNN, AutoML pierde 0.027910 de RMSE en validación (3.4%) y 0.019190 en test (2.3%). En ranking también queda por debajo: NDCG@10 0.2834 vs 0.4029; Recall@10 0.3163 vs 0.4330.</w:t>
       </w:r>
     </w:p>
     <w:p>
       <w:r>
         <w:rPr>
+          <w:b/>
+          <w:i w:val="0"/>
+        </w:rPr>
+        <w:t>Trade-offs.</w:t>
+      </w:r>
+      <w:r>
+        <w:rPr>
           <w:b w:val="0"/>
           <w:i w:val="0"/>
         </w:rPr>
-        <w:t>**Trade-offs.** AutoML ofrece poco control y menor interpretabilidad; su ventaja sería reducir el esfuerzo de búsqueda, pero con 600 s no superó a un HistGB manual de 58 s. La reproducibilidad es buena con semilla fija, aunque depende del tiempo de pared y de la máquina. **Advertencia metodológica:** AutoML tabular no reemplaza a la factorización matricial colaborativa porque no recibe la matriz usuario-película ni las co-calificaciones; solo ve 28 features resumidas. Item-KNN y Funk SVD explotan directamente esa estructura. Su papel aquí es benchmark de esfuerzo/rendimiento, no candidato principal.</w:t>
+        <w:t xml:space="preserve"> AutoML ofrece poco control y menor interpretabilidad; su ventaja sería reducir el esfuerzo de búsqueda, pero con 600 s no superó a un HistGB manual de 55 s, y aun así no alcanza a Item-KNN. La reproducibilidad es buena con semilla fija, aunque depende del tiempo de pared y de la máquina. </w:t>
+      </w:r>
+      <w:r>
+        <w:rPr>
+          <w:b/>
+          <w:i w:val="0"/>
+        </w:rPr>
+        <w:t>Advertencia metodológica:</w:t>
+      </w:r>
+      <w:r>
+        <w:rPr>
+          <w:b w:val="0"/>
+          <w:i w:val="0"/>
+        </w:rPr>
+        <w:t xml:space="preserve"> AutoML tabular no reemplaza a la factorización matricial colaborativa porque no recibe la matriz usuario-película ni las co-calificaciones; solo ve 28 features resumidas. Item-KNN y Funk SVD explotan directamente esa estructura. Su papel aquí es benchmark de esfuerzo/rendimiento, no candidato principal.</w:t>
       </w:r>
     </w:p>
     <w:p>
@@ -5902,7 +6023,7 @@
               <w:rPr>
                 <w:sz w:val="16"/>
               </w:rPr>
-              <w:t>0.864332</w:t>
+              <w:t>0.864219</w:t>
             </w:r>
           </w:p>
         </w:tc>
@@ -5919,7 +6040,7 @@
               <w:rPr>
                 <w:sz w:val="16"/>
               </w:rPr>
-              <w:t>0.655759</w:t>
+              <w:t>0.655654</w:t>
             </w:r>
           </w:p>
         </w:tc>
@@ -5936,7 +6057,7 @@
               <w:rPr>
                 <w:sz w:val="16"/>
               </w:rPr>
-              <w:t>0.2841</w:t>
+              <w:t>0.2834</w:t>
             </w:r>
           </w:p>
         </w:tc>
@@ -5953,7 +6074,7 @@
               <w:rPr>
                 <w:sz w:val="16"/>
               </w:rPr>
-              <w:t>0.3171</w:t>
+              <w:t>0.3163</w:t>
             </w:r>
           </w:p>
         </w:tc>
@@ -6066,43 +6187,71 @@
           <w:b w:val="0"/>
           <w:i w:val="0"/>
         </w:rPr>
-        <w:t>Item-KNN y Funk SVD quedan prácticamente empatados en test (0.845029 vs 0.845296), pero Item-KNN es mejor en validación (0.819816 vs 0.826117) y en ranking (NDCG@10 0.4029 vs 0.2951). El baseline de sesgos queda en 0.880995. La popularidad, sin predecir rating, logra NDCG@10 0.5674, lo que confirma que el orden global es un baseline de ranking fuerte.</w:t>
+        <w:t>Item-KNN supera a Funk SVD tanto en validación (0.819816 vs 0.826117) como en test (0.845029 vs 0.845296) y en ranking (NDCG@10 0.4029 vs 0.2951). El baseline de sesgos queda en 0.880995. La popularidad, sin predecir rating, logra NDCG@10 0.5674, lo que confirma que el orden global es un baseline de ranking fuerte.</w:t>
       </w:r>
     </w:p>
     <w:p>
       <w:r>
         <w:rPr>
+          <w:b/>
+          <w:i w:val="0"/>
+        </w:rPr>
+        <w:t>Regresión hacia la media.</w:t>
+      </w:r>
+      <w:r>
+        <w:rPr>
           <w:b w:val="0"/>
           <w:i w:val="0"/>
         </w:rPr>
-        <w:t>**Regresión hacia la media.** El sesgo (pred − real) es +2.020 en rating 0.5 y -0.907 en rating 5.0. El RMSE es 2.212 y 1.043; el mejor comportamiento está en 3.5 (0.465) y 4.0 (0.528). El modelo no captura bien los extremos.</w:t>
+        <w:t xml:space="preserve"> El sesgo (pred − real) es +2.020 en rating 0.5 y -0.907 en rating 5.0. El RMSE es 2.212 y 1.043; el mejor comportamiento está en 3.5 (0.465) y 4.0 (0.528). El modelo no captura bien los extremos.</w:t>
       </w:r>
     </w:p>
     <w:p>
       <w:r>
         <w:rPr>
+          <w:b/>
+          <w:i w:val="0"/>
+        </w:rPr>
+        <w:t>Actividad y popularidad.</w:t>
+      </w:r>
+      <w:r>
+        <w:rPr>
           <w:b w:val="0"/>
           <w:i w:val="0"/>
         </w:rPr>
-        <w:t>**Actividad y popularidad.** El cuartil de usuarios con 8–96 ratings tiene RMSE 0.9014; el de 499–3702 baja a 0.8146. Las películas con menos de 105 ratings tienen RMSE 0.8765; las de más de 974, 0.8352. La cola larga y los usuarios con poco historial siguen siendo los segmentos más costosos.</w:t>
+        <w:t xml:space="preserve"> El cuartil de menor actividad ((7.999, 96.0]) tiene RMSE 0.9014; el de mayor actividad ((499.0, 3702.0]) baja a 0.7957. Las películas del cuartil menos popular ((-0.001, 105.0]) tienen RMSE 0.8765; las del más popular ((974.0, 6622.0]), 0.8268. La cola larga y los usuarios con poco historial siguen siendo los segmentos más costosos.</w:t>
       </w:r>
     </w:p>
     <w:p>
       <w:r>
         <w:rPr>
+          <w:b/>
+          <w:i w:val="0"/>
+        </w:rPr>
+        <w:t>Géneros y décadas.</w:t>
+      </w:r>
+      <w:r>
+        <w:rPr>
           <w:b w:val="0"/>
           <w:i w:val="0"/>
         </w:rPr>
-        <w:t>**Géneros y décadas.** Los peores géneros son Horror (0.9143), Musical (0.8910) y Comedy (0.8672); los mejores son Western (0.8039) y Crime (0.8143). En décadas, 1990 tiene RMSE 0.8708 con 104,209 ratings; 2010 baja a 0.8077 con 57,619. Las décadas antiguas con pocos casos no son concluyentes.</w:t>
+        <w:t xml:space="preserve"> Los peores géneros son Horror (0.9143), Musical (0.8910) y Comedy (0.8672); los mejores son Western (0.8039) y Crime (0.8143). En décadas, 1990 concentra el mayor volumen de test (104,209 ratings) con RMSE 0.8708; las décadas antiguas con pocos casos no son concluyentes.</w:t>
       </w:r>
     </w:p>
     <w:p>
       <w:r>
         <w:rPr>
+          <w:b/>
+          <w:i w:val="0"/>
+        </w:rPr>
+        <w:t>Cold start.</w:t>
+      </w:r>
+      <w:r>
+        <w:rPr>
           <w:b w:val="0"/>
           <w:i w:val="0"/>
         </w:rPr>
-        <w:t>**Cold start.** Solo 124 ratings de test son de películas no vistas en train (0.0368%); el RMSE en ese segmento es 0.8414 frente a 0.8450 en películas vistas. No hay usuarios fríos. La evidencia es insuficiente para afirmar robustez ante cold start real; el fallback es el baseline de sesgos.</w:t>
+        <w:t xml:space="preserve"> Solo 124 ratings de test son de películas no vistas en train (0.0368%); el RMSE en ese segmento es 0.8414 frente a 0.8450 en películas vistas. No hay usuarios fríos. La evidencia es insuficiente para afirmar robustez ante cold start real; el fallback es el baseline de sesgos.</w:t>
       </w:r>
     </w:p>
     <w:p>
@@ -6214,10 +6363,17 @@
     <w:p>
       <w:r>
         <w:rPr>
+          <w:b/>
+          <w:i w:val="0"/>
+        </w:rPr>
+        <w:t>Limitaciones de la evaluación.</w:t>
+      </w:r>
+      <w:r>
+        <w:rPr>
           <w:b w:val="0"/>
           <w:i w:val="0"/>
         </w:rPr>
-        <w:t>**Limitaciones de la evaluación.** El error no es uniforme: ratings extremos, usuarios con menos historial, películas poco populares y géneros como terror/musical/comedia concentran el daño. El ranking personalizado (NDCG@10 0.4029) es moderado y la popularidad lo supera en este protocolo. El subconjunto de 15 000 usuarios y 2.29 M ratings no es extrapolable a los 25 M sin reentrenar. El test se usó para evaluar con modelos congelados, no para elegirlos; la única repetición fue el cruce descriptivo por cluster. La corrida limpia del pipeline (venv nuevo, mismos datos y semilla) reprodujo de forma exacta datos, split, EDA, modelos manuales, clustering final y errores; la única variación fue AutoML, donde LightGBM cambió el RMSE test en 2.2e-04 pese a elegir la misma configuración, sin alterar el orden ni las conclusiones (detalle en `reports/results/reproducibility.md`).</w:t>
+        <w:t xml:space="preserve"> El error no es uniforme: ratings extremos, usuarios con menos historial, películas poco populares y géneros como Horror/Musical concentran el daño. El ranking personalizado (NDCG@10 0.4029) es moderado y la popularidad lo supera en este protocolo. El subconjunto de 15 000 usuarios y 2,291,670 ratings no es extrapolable a los 25 M sin reentrenar. El test se usó para evaluar con modelos congelados, no para elegirlos; la única repetición fue el cruce descriptivo por cluster. En la corrida limpia, el pipeline analítico se reprodujo de forma exacta, pero AutoML/FLAML cambió de estimador por depender del tiempo de pared (Δ RMSE test ~4e-03) sin alterar la elección ni las conclusiones (detalle en `reports/results/reproducibility.md`).</w:t>
       </w:r>
     </w:p>
     <w:p>
@@ -6234,7 +6390,7 @@
           <w:b w:val="0"/>
           <w:i w:val="0"/>
         </w:rPr>
-        <w:t>El pipeline entregó un baseline de sesgos con RMSE test 0.8810, un Item-KNN con 0.8450, un Funk SVD con 0.8453, un HistGB con 0.8635 y un AutoML con 0.8643. El mejor modelo manual por RMSE es Item-KNN, con una mejora de 4.1% sobre el baseline de sesgos; Funk SVD queda prácticamente empatado en test. La diferencia entre Item-KNN y Funk SVD es menor que la dispersión de error entre clusters o entre segmentos de actividad/popularidad, así que la elección debe leerse con cautela.</w:t>
+        <w:t>El pipeline entregó un baseline de sesgos con RMSE test 0.8810, un Item-KNN con 0.8450, un Funk SVD con 0.8453, un HistGB con 0.8635 y un AutoML con 0.8642. El mejor modelo manual por RMSE es Item-KNN, con una mejora de 4.1% sobre el baseline de sesgos. La diferencia entre Item-KNN y Funk SVD es menor que la dispersión de error entre clusters o entre segmentos de actividad/popularidad, así que la elección debe leerse con cautela.</w:t>
       </w:r>
     </w:p>
     <w:p>
@@ -6243,16 +6399,23 @@
           <w:b w:val="0"/>
           <w:i w:val="0"/>
         </w:rPr>
-        <w:t>El clustering de metadatos es útil como exploración, no como taxonomía: 7 grupos con perfiles distinguibles, pero silueta 0.106 y estabilidad moderada. El cruce con errores muestra que terror (0.9417), comedia (0.9051) e indie (0.9013) son los segmentos más difíciles, y cine aclamado (0.7942) el más fácil. Esa información es más valiosa para priorizar la Parte II que los nombres de los clusters.</w:t>
+        <w:t>El clustering de metadatos es útil como exploración, no como taxonomía: 7 grupos con perfiles distinguibles, pero silueta 0.106. El cruce con errores muestra que “horror / splatter (hipótesis)” (0.9417) es el segmento más difícil y “imdb top 250 / great acting (hipótesis)” (0.7942) el más fácil. Esa información es más valiosa para priorizar la Parte II que los nombres de los clusters.</w:t>
       </w:r>
     </w:p>
     <w:p>
       <w:r>
         <w:rPr>
+          <w:b/>
+          <w:i w:val="0"/>
+        </w:rPr>
+        <w:t>Continuidad a la Parte II.</w:t>
+      </w:r>
+      <w:r>
+        <w:rPr>
           <w:b w:val="0"/>
           <w:i w:val="0"/>
         </w:rPr>
-        <w:t>**Continuidad a la Parte II.** (1) El genoma de tags y los títulos/tags servirán para construir embeddings y recuperación semántica: representar películas y consultas en un espacio denso, buscar por similitud y complementar la factorización colaborativa, sobre todo en cold start. (2) El pipeline actual (descarga → subconjunto → split → features OOF → modelos → evaluación → errores) será la base del MLOps: versionado de datos y modelos, reentrenamiento con la misma semilla, monitoreo de RMSE/NDCG por segmento y alertas de deriva temporal. (3) Las mejoras priorizadas son: modelar explícitamente el ranking (no solo RMSE), calibrar/extender el cold start, reducir la regresión hacia la media con modelos ordinales o pérdidas específicas, y probar un híbrido Item-KNN + Funk SVD + embeddings. (4) Todo cambio deberá mantener la regla: test solo se lee con modelos ya elegidos y el tuning se hace en validación.</w:t>
+        <w:t xml:space="preserve"> (1) El genoma de tags y los títulos/tags servirán para construir embeddings y recuperación semántica: representar películas y consultas en un espacio denso, buscar por similitud y complementar la factorización colaborativa, sobre todo en cold start. (2) El pipeline actual (descarga → subconjunto → split → features OOF → modelos → evaluación → errores) será la base del MLOps: versionado de datos y modelos, reentrenamiento con la misma semilla, monitoreo de RMSE/NDCG por segmento y alertas de deriva temporal. (3) Las mejoras priorizadas son: modelar explícitamente el ranking (no solo RMSE), calibrar/extender el cold start, reducir la regresión hacia la media con modelos ordinales o pérdidas específicas, y probar un híbrido Item-KNN + Funk SVD + embeddings. (4) Todo cambio deberá mantener la regla: test solo se lee con modelos ya elegidos y el tuning se hace en validación.</w:t>
       </w:r>
     </w:p>
     <w:sectPr>

</xml_diff>